<commit_message>
[reporting][subdocs]Updtaed templates, comment #639
</commit_message>
<xml_diff>
--- a/reporting/subdocs_templates/table_of_evolution_of_the_weakest_security_objectives_template.docx
+++ b/reporting/subdocs_templates/table_of_evolution_of_the_weakest_security_objectives_template.docx
@@ -4,17 +4,17 @@
   <w:body>
     <w:tbl>
       <w:tblPr>
-        <w:tblW w:w="5167" w:type="pct"/>
+        <w:tblW w:w="9639" w:type="dxa"/>
         <w:tblLayout w:type="fixed"/>
         <w:tblLook w:val="04A0" w:firstRow="1" w:lastRow="0" w:firstColumn="1" w:lastColumn="0" w:noHBand="0" w:noVBand="1"/>
       </w:tblPr>
       <w:tblGrid>
-        <w:gridCol w:w="4248"/>
-        <w:gridCol w:w="854"/>
-        <w:gridCol w:w="1045"/>
-        <w:gridCol w:w="848"/>
-        <w:gridCol w:w="2653"/>
-        <w:gridCol w:w="14"/>
+        <w:gridCol w:w="4238"/>
+        <w:gridCol w:w="852"/>
+        <w:gridCol w:w="1043"/>
+        <w:gridCol w:w="846"/>
+        <w:gridCol w:w="2647"/>
+        <w:gridCol w:w="13"/>
       </w:tblGrid>
       <w:tr>
         <w:trPr>

</xml_diff>

<commit_message>
[reporting][subdocs]Updatated layout , comment #639
</commit_message>
<xml_diff>
--- a/reporting/subdocs_templates/table_of_evolution_of_the_weakest_security_objectives_template.docx
+++ b/reporting/subdocs_templates/table_of_evolution_of_the_weakest_security_objectives_template.docx
@@ -9,21 +9,19 @@
         <w:tblLook w:val="04A0" w:firstRow="1" w:lastRow="0" w:firstColumn="1" w:lastColumn="0" w:noHBand="0" w:noVBand="1"/>
       </w:tblPr>
       <w:tblGrid>
-        <w:gridCol w:w="4238"/>
-        <w:gridCol w:w="852"/>
-        <w:gridCol w:w="1043"/>
-        <w:gridCol w:w="846"/>
-        <w:gridCol w:w="2647"/>
-        <w:gridCol w:w="13"/>
+        <w:gridCol w:w="3162"/>
+        <w:gridCol w:w="1007"/>
+        <w:gridCol w:w="1296"/>
+        <w:gridCol w:w="1151"/>
+        <w:gridCol w:w="3023"/>
       </w:tblGrid>
       <w:tr>
         <w:trPr>
-          <w:gridAfter w:val="1"/>
-          <w:wAfter w:w="6" w:type="pct"/>
+          <w:trHeight w:val="340"/>
         </w:trPr>
         <w:tc>
           <w:tcPr>
-            <w:tcW w:w="2198" w:type="pct"/>
+            <w:tcW w:w="3114" w:type="dxa"/>
             <w:tcBorders>
               <w:top w:val="single" w:sz="12" w:space="0" w:color="auto"/>
               <w:left w:val="single" w:sz="4" w:space="0" w:color="FFFFFF" w:themeColor="background1"/>
@@ -67,7 +65,7 @@
         </w:tc>
         <w:tc>
           <w:tcPr>
-            <w:tcW w:w="442" w:type="pct"/>
+            <w:tcW w:w="992" w:type="dxa"/>
             <w:tcBorders>
               <w:top w:val="single" w:sz="12" w:space="0" w:color="auto"/>
               <w:left w:val="nil"/>
@@ -137,7 +135,7 @@
         </w:tc>
         <w:tc>
           <w:tcPr>
-            <w:tcW w:w="541" w:type="pct"/>
+            <w:tcW w:w="1276" w:type="dxa"/>
             <w:tcBorders>
               <w:top w:val="single" w:sz="12" w:space="0" w:color="auto"/>
               <w:left w:val="nil"/>
@@ -168,7 +166,7 @@
         </w:tc>
         <w:tc>
           <w:tcPr>
-            <w:tcW w:w="439" w:type="pct"/>
+            <w:tcW w:w="1134" w:type="dxa"/>
             <w:tcBorders>
               <w:top w:val="single" w:sz="12" w:space="0" w:color="auto"/>
               <w:left w:val="nil"/>
@@ -195,7 +193,7 @@
         </w:tc>
         <w:tc>
           <w:tcPr>
-            <w:tcW w:w="1373" w:type="pct"/>
+            <w:tcW w:w="2977" w:type="dxa"/>
             <w:tcBorders>
               <w:top w:val="single" w:sz="12" w:space="0" w:color="auto"/>
               <w:left w:val="single" w:sz="8" w:space="0" w:color="auto"/>
@@ -225,12 +223,12 @@
       </w:tr>
       <w:tr>
         <w:trPr>
-          <w:trHeight w:val="454"/>
+          <w:trHeight w:val="340"/>
         </w:trPr>
         <w:tc>
           <w:tcPr>
-            <w:tcW w:w="5000" w:type="pct"/>
-            <w:gridSpan w:val="6"/>
+            <w:tcW w:w="9493" w:type="dxa"/>
+            <w:gridSpan w:val="5"/>
             <w:tcBorders>
               <w:top w:val="single" w:sz="12" w:space="0" w:color="auto"/>
               <w:left w:val="single" w:sz="4" w:space="0" w:color="FFFFFF" w:themeColor="background1"/>
@@ -306,13 +304,11 @@
       </w:tr>
       <w:tr>
         <w:trPr>
-          <w:gridAfter w:val="1"/>
-          <w:wAfter w:w="6" w:type="pct"/>
-          <w:trHeight w:val="397"/>
+          <w:trHeight w:val="340"/>
         </w:trPr>
         <w:tc>
           <w:tcPr>
-            <w:tcW w:w="2198" w:type="pct"/>
+            <w:tcW w:w="3114" w:type="dxa"/>
             <w:tcBorders>
               <w:top w:val="nil"/>
               <w:left w:val="single" w:sz="4" w:space="0" w:color="FFFFFF" w:themeColor="background1"/>
@@ -342,7 +338,7 @@
         </w:tc>
         <w:tc>
           <w:tcPr>
-            <w:tcW w:w="442" w:type="pct"/>
+            <w:tcW w:w="992" w:type="dxa"/>
             <w:tcBorders>
               <w:top w:val="nil"/>
               <w:left w:val="single" w:sz="4" w:space="0" w:color="A6A6A6" w:themeColor="background1" w:themeShade="A6"/>
@@ -417,7 +413,7 @@
         </w:tc>
         <w:tc>
           <w:tcPr>
-            <w:tcW w:w="541" w:type="pct"/>
+            <w:tcW w:w="1276" w:type="dxa"/>
             <w:tcBorders>
               <w:top w:val="nil"/>
               <w:left w:val="single" w:sz="4" w:space="0" w:color="A6A6A6" w:themeColor="background1" w:themeShade="A6"/>
@@ -504,7 +500,7 @@
         </w:tc>
         <w:tc>
           <w:tcPr>
-            <w:tcW w:w="439" w:type="pct"/>
+            <w:tcW w:w="1134" w:type="dxa"/>
             <w:tcBorders>
               <w:top w:val="single" w:sz="4" w:space="0" w:color="auto"/>
               <w:left w:val="single" w:sz="4" w:space="0" w:color="A6A6A6" w:themeColor="background1" w:themeShade="A6"/>
@@ -523,7 +519,7 @@
         </w:tc>
         <w:tc>
           <w:tcPr>
-            <w:tcW w:w="1373" w:type="pct"/>
+            <w:tcW w:w="2977" w:type="dxa"/>
             <w:tcBorders>
               <w:top w:val="single" w:sz="4" w:space="0" w:color="auto"/>
               <w:left w:val="single" w:sz="4" w:space="0" w:color="A6A6A6" w:themeColor="background1" w:themeShade="A6"/>
@@ -731,12 +727,12 @@
       </w:tr>
       <w:tr>
         <w:trPr>
-          <w:trHeight w:val="397"/>
+          <w:trHeight w:val="340"/>
         </w:trPr>
         <w:tc>
           <w:tcPr>
-            <w:tcW w:w="5000" w:type="pct"/>
-            <w:gridSpan w:val="6"/>
+            <w:tcW w:w="9493" w:type="dxa"/>
+            <w:gridSpan w:val="5"/>
             <w:tcBorders>
               <w:top w:val="single" w:sz="4" w:space="0" w:color="A5A5A5" w:themeColor="accent3"/>
               <w:left w:val="single" w:sz="4" w:space="0" w:color="FFFFFF" w:themeColor="background1"/>

</xml_diff>

<commit_message>
[reporting][subdocs]Updated layout, comment #639
</commit_message>
<xml_diff>
--- a/reporting/subdocs_templates/table_of_evolution_of_the_weakest_security_objectives_template.docx
+++ b/reporting/subdocs_templates/table_of_evolution_of_the_weakest_security_objectives_template.docx
@@ -26,7 +26,7 @@
               <w:top w:val="single" w:sz="12" w:space="0" w:color="auto"/>
               <w:left w:val="single" w:sz="4" w:space="0" w:color="FFFFFF" w:themeColor="background1"/>
               <w:bottom w:val="single" w:sz="12" w:space="0" w:color="auto"/>
-              <w:right w:val="single" w:sz="8" w:space="0" w:color="auto"/>
+              <w:right w:val="single" w:sz="4" w:space="0" w:color="A6A6A6" w:themeColor="background1" w:themeShade="A6"/>
             </w:tcBorders>
             <w:noWrap/>
             <w:vAlign w:val="center"/>
@@ -68,9 +68,9 @@
             <w:tcW w:w="992" w:type="dxa"/>
             <w:tcBorders>
               <w:top w:val="single" w:sz="12" w:space="0" w:color="auto"/>
-              <w:left w:val="nil"/>
+              <w:left w:val="single" w:sz="4" w:space="0" w:color="A6A6A6" w:themeColor="background1" w:themeShade="A6"/>
               <w:bottom w:val="single" w:sz="12" w:space="0" w:color="auto"/>
-              <w:right w:val="single" w:sz="8" w:space="0" w:color="auto"/>
+              <w:right w:val="single" w:sz="4" w:space="0" w:color="A6A6A6" w:themeColor="background1" w:themeShade="A6"/>
             </w:tcBorders>
             <w:noWrap/>
             <w:vAlign w:val="center"/>
@@ -138,9 +138,9 @@
             <w:tcW w:w="1276" w:type="dxa"/>
             <w:tcBorders>
               <w:top w:val="single" w:sz="12" w:space="0" w:color="auto"/>
-              <w:left w:val="nil"/>
+              <w:left w:val="single" w:sz="4" w:space="0" w:color="A6A6A6" w:themeColor="background1" w:themeShade="A6"/>
               <w:bottom w:val="single" w:sz="12" w:space="0" w:color="auto"/>
-              <w:right w:val="single" w:sz="8" w:space="0" w:color="auto"/>
+              <w:right w:val="single" w:sz="4" w:space="0" w:color="A6A6A6" w:themeColor="background1" w:themeShade="A6"/>
             </w:tcBorders>
             <w:noWrap/>
             <w:vAlign w:val="center"/>
@@ -169,9 +169,9 @@
             <w:tcW w:w="1134" w:type="dxa"/>
             <w:tcBorders>
               <w:top w:val="single" w:sz="12" w:space="0" w:color="auto"/>
-              <w:left w:val="nil"/>
+              <w:left w:val="single" w:sz="4" w:space="0" w:color="A6A6A6" w:themeColor="background1" w:themeShade="A6"/>
               <w:bottom w:val="single" w:sz="12" w:space="0" w:color="auto"/>
-              <w:right w:val="single" w:sz="8" w:space="0" w:color="auto"/>
+              <w:right w:val="single" w:sz="4" w:space="0" w:color="A6A6A6" w:themeColor="background1" w:themeShade="A6"/>
             </w:tcBorders>
           </w:tcPr>
           <w:p>
@@ -196,7 +196,7 @@
             <w:tcW w:w="2977" w:type="dxa"/>
             <w:tcBorders>
               <w:top w:val="single" w:sz="12" w:space="0" w:color="auto"/>
-              <w:left w:val="single" w:sz="8" w:space="0" w:color="auto"/>
+              <w:left w:val="single" w:sz="4" w:space="0" w:color="A6A6A6" w:themeColor="background1" w:themeShade="A6"/>
               <w:bottom w:val="single" w:sz="12" w:space="0" w:color="auto"/>
               <w:right w:val="single" w:sz="4" w:space="0" w:color="FFFFFF" w:themeColor="background1"/>
             </w:tcBorders>
@@ -232,7 +232,7 @@
             <w:tcBorders>
               <w:top w:val="single" w:sz="12" w:space="0" w:color="auto"/>
               <w:left w:val="single" w:sz="4" w:space="0" w:color="FFFFFF" w:themeColor="background1"/>
-              <w:bottom w:val="single" w:sz="12" w:space="0" w:color="auto"/>
+              <w:bottom w:val="single" w:sz="4" w:space="0" w:color="A6A6A6" w:themeColor="background1" w:themeShade="A6"/>
               <w:right w:val="single" w:sz="4" w:space="0" w:color="FFFFFF" w:themeColor="background1"/>
             </w:tcBorders>
             <w:noWrap/>
@@ -310,7 +310,7 @@
           <w:tcPr>
             <w:tcW w:w="3114" w:type="dxa"/>
             <w:tcBorders>
-              <w:top w:val="nil"/>
+              <w:top w:val="single" w:sz="4" w:space="0" w:color="A6A6A6" w:themeColor="background1" w:themeShade="A6"/>
               <w:left w:val="single" w:sz="4" w:space="0" w:color="FFFFFF" w:themeColor="background1"/>
               <w:bottom w:val="single" w:sz="4" w:space="0" w:color="A6A6A6" w:themeColor="background1" w:themeShade="A6"/>
               <w:right w:val="single" w:sz="4" w:space="0" w:color="A6A6A6" w:themeColor="background1" w:themeShade="A6"/>
@@ -340,7 +340,7 @@
           <w:tcPr>
             <w:tcW w:w="992" w:type="dxa"/>
             <w:tcBorders>
-              <w:top w:val="nil"/>
+              <w:top w:val="single" w:sz="4" w:space="0" w:color="A6A6A6" w:themeColor="background1" w:themeShade="A6"/>
               <w:left w:val="single" w:sz="4" w:space="0" w:color="A6A6A6" w:themeColor="background1" w:themeShade="A6"/>
               <w:bottom w:val="single" w:sz="4" w:space="0" w:color="A5A5A5" w:themeColor="accent3"/>
               <w:right w:val="single" w:sz="4" w:space="0" w:color="A6A6A6" w:themeColor="background1" w:themeShade="A6"/>
@@ -415,7 +415,7 @@
           <w:tcPr>
             <w:tcW w:w="1276" w:type="dxa"/>
             <w:tcBorders>
-              <w:top w:val="nil"/>
+              <w:top w:val="single" w:sz="4" w:space="0" w:color="A6A6A6" w:themeColor="background1" w:themeShade="A6"/>
               <w:left w:val="single" w:sz="4" w:space="0" w:color="A6A6A6" w:themeColor="background1" w:themeShade="A6"/>
               <w:bottom w:val="single" w:sz="4" w:space="0" w:color="A6A6A6" w:themeColor="background1" w:themeShade="A6"/>
               <w:right w:val="single" w:sz="4" w:space="0" w:color="A6A6A6" w:themeColor="background1" w:themeShade="A6"/>
@@ -502,7 +502,7 @@
           <w:tcPr>
             <w:tcW w:w="1134" w:type="dxa"/>
             <w:tcBorders>
-              <w:top w:val="single" w:sz="4" w:space="0" w:color="auto"/>
+              <w:top w:val="single" w:sz="4" w:space="0" w:color="A6A6A6" w:themeColor="background1" w:themeShade="A6"/>
               <w:left w:val="single" w:sz="4" w:space="0" w:color="A6A6A6" w:themeColor="background1" w:themeShade="A6"/>
               <w:bottom w:val="single" w:sz="4" w:space="0" w:color="A6A6A6" w:themeColor="background1" w:themeShade="A6"/>
               <w:right w:val="single" w:sz="4" w:space="0" w:color="A6A6A6" w:themeColor="background1" w:themeShade="A6"/>
@@ -521,7 +521,7 @@
           <w:tcPr>
             <w:tcW w:w="2977" w:type="dxa"/>
             <w:tcBorders>
-              <w:top w:val="single" w:sz="4" w:space="0" w:color="auto"/>
+              <w:top w:val="single" w:sz="4" w:space="0" w:color="A6A6A6" w:themeColor="background1" w:themeShade="A6"/>
               <w:left w:val="single" w:sz="4" w:space="0" w:color="A6A6A6" w:themeColor="background1" w:themeShade="A6"/>
               <w:bottom w:val="single" w:sz="4" w:space="0" w:color="A6A6A6" w:themeColor="background1" w:themeShade="A6"/>
               <w:right w:val="single" w:sz="4" w:space="0" w:color="FFFFFF" w:themeColor="background1"/>

</xml_diff>

<commit_message>
[reporting][helpers]Refactored build helpers, comment #639
</commit_message>
<xml_diff>
--- a/reporting/subdocs_templates/table_of_evolution_of_the_weakest_security_objectives_template.docx
+++ b/reporting/subdocs_templates/table_of_evolution_of_the_weakest_security_objectives_template.docx
@@ -109,27 +109,23 @@
                 <w:bCs/>
                 <w:lang w:val="en-US"/>
               </w:rPr>
-              <w:t xml:space="preserve"> for year in </w:t>
-            </w:r>
-            <w:proofErr w:type="spellStart"/>
-            <w:proofErr w:type="gramStart"/>
-            <w:r>
-              <w:rPr>
-                <w:b/>
-                <w:bCs/>
-                <w:lang w:val="en-US"/>
-              </w:rPr>
-              <w:t>table.years</w:t>
-            </w:r>
-            <w:proofErr w:type="spellEnd"/>
-            <w:proofErr w:type="gramEnd"/>
-            <w:r>
-              <w:rPr>
-                <w:b/>
-                <w:bCs/>
-                <w:lang w:val="en-US"/>
-              </w:rPr>
-              <w:t xml:space="preserve"> %}</w:t>
+              <w:t xml:space="preserve"> for year in</w:t>
+            </w:r>
+            <w:r>
+              <w:rPr>
+                <w:b/>
+                <w:bCs/>
+                <w:lang w:val="en-US"/>
+              </w:rPr>
+              <w:t xml:space="preserve"> </w:t>
+            </w:r>
+            <w:r>
+              <w:rPr>
+                <w:b/>
+                <w:bCs/>
+                <w:lang w:val="en-US"/>
+              </w:rPr>
+              <w:t>years %}</w:t>
             </w:r>
           </w:p>
         </w:tc>
@@ -265,33 +261,17 @@
               </w:rPr>
               <w:t xml:space="preserve"> in </w:t>
             </w:r>
-            <w:proofErr w:type="spellStart"/>
-            <w:r>
-              <w:rPr>
-                <w:lang w:val="en-US"/>
-              </w:rPr>
-              <w:t>table.</w:t>
-            </w:r>
-            <w:proofErr w:type="gramStart"/>
-            <w:r>
-              <w:rPr>
-                <w:lang w:val="en-US"/>
-              </w:rPr>
-              <w:t>data</w:t>
-            </w:r>
-            <w:proofErr w:type="spellEnd"/>
-            <w:r>
-              <w:rPr>
-                <w:lang w:val="en-US"/>
-              </w:rPr>
-              <w:t>[</w:t>
-            </w:r>
-            <w:proofErr w:type="gramEnd"/>
-            <w:r>
-              <w:rPr>
-                <w:lang w:val="en-US"/>
-              </w:rPr>
-              <w:t>:5]</w:t>
+            <w:r>
+              <w:rPr>
+                <w:lang w:val="en-US"/>
+              </w:rPr>
+              <w:t>table</w:t>
+            </w:r>
+            <w:r>
+              <w:rPr>
+                <w:lang w:val="en-US"/>
+              </w:rPr>
+              <w:t>[:5]</w:t>
             </w:r>
             <w:r>
               <w:rPr>
@@ -388,7 +368,6 @@
               <w:t xml:space="preserve"> in </w:t>
             </w:r>
             <w:proofErr w:type="spellStart"/>
-            <w:proofErr w:type="gramStart"/>
             <w:r>
               <w:rPr>
                 <w:lang w:val="en-US"/>
@@ -399,10 +378,9 @@
               <w:rPr>
                 <w:lang w:val="en-US"/>
               </w:rPr>
-              <w:t>years</w:t>
+              <w:t>score</w:t>
             </w:r>
             <w:proofErr w:type="spellEnd"/>
-            <w:proofErr w:type="gramEnd"/>
             <w:r>
               <w:rPr>
                 <w:lang w:val="en-US"/>
@@ -439,7 +417,6 @@
               <w:t xml:space="preserve">{% if </w:t>
             </w:r>
             <w:proofErr w:type="spellStart"/>
-            <w:proofErr w:type="gramStart"/>
             <w:r>
               <w:rPr>
                 <w:lang w:val="en-US"/>
@@ -447,7 +424,6 @@
               <w:t>y.color</w:t>
             </w:r>
             <w:proofErr w:type="spellEnd"/>
-            <w:proofErr w:type="gramEnd"/>
             <w:r>
               <w:rPr>
                 <w:lang w:val="en-US"/>
@@ -555,7 +531,6 @@
               <w:t xml:space="preserve">evo in </w:t>
             </w:r>
             <w:proofErr w:type="spellStart"/>
-            <w:proofErr w:type="gramStart"/>
             <w:r>
               <w:rPr>
                 <w:lang w:val="en-US"/>
@@ -569,7 +544,6 @@
               <w:t>ow.evolution</w:t>
             </w:r>
             <w:proofErr w:type="spellEnd"/>
-            <w:proofErr w:type="gramEnd"/>
             <w:r>
               <w:rPr>
                 <w:lang w:val="en-US"/>

</xml_diff>

<commit_message>
[reporting][sub_docs]Improved subdocs templaets, comment #639
</commit_message>
<xml_diff>
--- a/reporting/subdocs_templates/table_of_evolution_of_the_weakest_security_objectives_template.docx
+++ b/reporting/subdocs_templates/table_of_evolution_of_the_weakest_security_objectives_template.docx
@@ -91,25 +91,7 @@
                 <w:bCs/>
                 <w:lang w:val="en-US"/>
               </w:rPr>
-              <w:t>{%</w:t>
-            </w:r>
-            <w:proofErr w:type="spellStart"/>
-            <w:r>
-              <w:rPr>
-                <w:b/>
-                <w:bCs/>
-                <w:lang w:val="en-US"/>
-              </w:rPr>
-              <w:t>tc</w:t>
-            </w:r>
-            <w:proofErr w:type="spellEnd"/>
-            <w:r>
-              <w:rPr>
-                <w:b/>
-                <w:bCs/>
-                <w:lang w:val="en-US"/>
-              </w:rPr>
-              <w:t xml:space="preserve"> for year in</w:t>
+              <w:t>{%tc for year in</w:t>
             </w:r>
             <w:r>
               <w:rPr>
@@ -339,21 +321,7 @@
               <w:rPr>
                 <w:lang w:val="en-US"/>
               </w:rPr>
-              <w:t>{%</w:t>
-            </w:r>
-            <w:proofErr w:type="spellStart"/>
-            <w:r>
-              <w:rPr>
-                <w:lang w:val="en-US"/>
-              </w:rPr>
-              <w:t>tc</w:t>
-            </w:r>
-            <w:proofErr w:type="spellEnd"/>
-            <w:r>
-              <w:rPr>
-                <w:lang w:val="en-US"/>
-              </w:rPr>
-              <w:t xml:space="preserve"> for </w:t>
+              <w:t xml:space="preserve">{%tc for </w:t>
             </w:r>
             <w:r>
               <w:rPr>
@@ -367,7 +335,6 @@
               </w:rPr>
               <w:t xml:space="preserve"> in </w:t>
             </w:r>
-            <w:proofErr w:type="spellStart"/>
             <w:r>
               <w:rPr>
                 <w:lang w:val="en-US"/>
@@ -380,7 +347,6 @@
               </w:rPr>
               <w:t>score</w:t>
             </w:r>
-            <w:proofErr w:type="spellEnd"/>
             <w:r>
               <w:rPr>
                 <w:lang w:val="en-US"/>
@@ -414,63 +380,25 @@
               <w:rPr>
                 <w:lang w:val="en-US"/>
               </w:rPr>
-              <w:t xml:space="preserve">{% if </w:t>
-            </w:r>
-            <w:proofErr w:type="spellStart"/>
-            <w:r>
-              <w:rPr>
-                <w:lang w:val="en-US"/>
-              </w:rPr>
-              <w:t>y.color</w:t>
-            </w:r>
-            <w:proofErr w:type="spellEnd"/>
-            <w:r>
-              <w:rPr>
-                <w:lang w:val="en-US"/>
-              </w:rPr>
-              <w:t xml:space="preserve"> %}{% </w:t>
-            </w:r>
-            <w:proofErr w:type="spellStart"/>
-            <w:r>
-              <w:rPr>
-                <w:lang w:val="en-US"/>
-              </w:rPr>
-              <w:t>cellbg</w:t>
-            </w:r>
-            <w:proofErr w:type="spellEnd"/>
-            <w:r>
-              <w:rPr>
-                <w:lang w:val="en-US"/>
-              </w:rPr>
-              <w:t xml:space="preserve"> </w:t>
-            </w:r>
-            <w:proofErr w:type="spellStart"/>
-            <w:r>
-              <w:rPr>
-                <w:lang w:val="en-US"/>
-              </w:rPr>
-              <w:t>y.color</w:t>
-            </w:r>
-            <w:proofErr w:type="spellEnd"/>
-            <w:r>
-              <w:rPr>
-                <w:lang w:val="en-US"/>
-              </w:rPr>
-              <w:t xml:space="preserve"> %}{% endif %}{{ </w:t>
-            </w:r>
-            <w:proofErr w:type="spellStart"/>
-            <w:r>
-              <w:rPr>
-                <w:lang w:val="en-US"/>
-              </w:rPr>
-              <w:t>y.value</w:t>
-            </w:r>
-            <w:proofErr w:type="spellEnd"/>
-            <w:r>
-              <w:rPr>
-                <w:lang w:val="en-US"/>
-              </w:rPr>
-              <w:t xml:space="preserve"> }}</w:t>
+              <w:t>{% if y.color %}{% cellbg y.color %}{% endif %}</w:t>
+            </w:r>
+            <w:r>
+              <w:rPr>
+                <w:lang w:val="en-US"/>
+              </w:rPr>
+              <w:t>{</w:t>
+            </w:r>
+            <w:r>
+              <w:rPr>
+                <w:lang w:val="en-US"/>
+              </w:rPr>
+              <w:t>{</w:t>
+            </w:r>
+            <w:r>
+              <w:rPr>
+                <w:lang w:val="en-US"/>
+              </w:rPr>
+              <w:t xml:space="preserve"> y.value if y.value is not none else "-" }}</w:t>
             </w:r>
           </w:p>
         </w:tc>
@@ -516,185 +444,43 @@
               <w:rPr>
                 <w:lang w:val="en-US"/>
               </w:rPr>
-              <w:t xml:space="preserve">{% </w:t>
-            </w:r>
-            <w:r>
-              <w:rPr>
-                <w:lang w:val="en-US"/>
-              </w:rPr>
-              <w:t xml:space="preserve">for </w:t>
-            </w:r>
-            <w:r>
-              <w:rPr>
-                <w:lang w:val="en-US"/>
-              </w:rPr>
-              <w:t xml:space="preserve">evo in </w:t>
-            </w:r>
-            <w:proofErr w:type="spellStart"/>
-            <w:r>
-              <w:rPr>
-                <w:lang w:val="en-US"/>
-              </w:rPr>
-              <w:t>r</w:t>
-            </w:r>
-            <w:r>
-              <w:rPr>
-                <w:lang w:val="en-US"/>
-              </w:rPr>
-              <w:t>ow.evolution</w:t>
-            </w:r>
-            <w:proofErr w:type="spellEnd"/>
-            <w:r>
-              <w:rPr>
-                <w:lang w:val="en-US"/>
-              </w:rPr>
-              <w:t xml:space="preserve"> %}</w:t>
-            </w:r>
-            <w:r>
-              <w:rPr>
-                <w:lang w:val="en-US"/>
-              </w:rPr>
-              <w:t xml:space="preserve">{% if not </w:t>
-            </w:r>
-            <w:proofErr w:type="spellStart"/>
-            <w:r>
-              <w:rPr>
-                <w:lang w:val="en-US"/>
-              </w:rPr>
-              <w:t>loop.first</w:t>
-            </w:r>
-            <w:proofErr w:type="spellEnd"/>
-            <w:r>
-              <w:rPr>
-                <w:lang w:val="en-US"/>
-              </w:rPr>
-              <w:t xml:space="preserve"> %}</w:t>
-            </w:r>
-            <w:r>
-              <w:rPr>
-                <w:lang w:val="en-US"/>
-              </w:rPr>
-              <w:t>{% if evo %}</w:t>
-            </w:r>
-            <w:r>
-              <w:rPr>
-                <w:lang w:val="en-US"/>
-              </w:rPr>
-              <w:t xml:space="preserve"> </w:t>
-            </w:r>
-            <w:r>
-              <w:rPr>
-                <w:lang w:val="en-US"/>
-              </w:rPr>
-              <w:t>↗</w:t>
-            </w:r>
-            <w:r>
-              <w:rPr>
-                <w:lang w:val="en-US"/>
-              </w:rPr>
-              <w:t xml:space="preserve"> </w:t>
-            </w:r>
-            <w:r>
-              <w:rPr>
-                <w:lang w:val="en-US"/>
-              </w:rPr>
-              <w:t xml:space="preserve">{% </w:t>
-            </w:r>
-            <w:proofErr w:type="spellStart"/>
-            <w:r>
-              <w:rPr>
-                <w:lang w:val="en-US"/>
-              </w:rPr>
-              <w:t>elif</w:t>
-            </w:r>
-            <w:proofErr w:type="spellEnd"/>
-            <w:r>
-              <w:rPr>
-                <w:lang w:val="en-US"/>
-              </w:rPr>
-              <w:t xml:space="preserve"> evo is </w:t>
-            </w:r>
-            <w:proofErr w:type="spellStart"/>
-            <w:r>
-              <w:rPr>
-                <w:lang w:val="en-US"/>
-              </w:rPr>
-              <w:t>sameas</w:t>
-            </w:r>
-            <w:proofErr w:type="spellEnd"/>
-            <w:r>
-              <w:rPr>
-                <w:lang w:val="en-US"/>
-              </w:rPr>
-              <w:t xml:space="preserve"> false %}</w:t>
-            </w:r>
-            <w:r>
-              <w:rPr>
-                <w:lang w:val="en-US"/>
-              </w:rPr>
-              <w:t xml:space="preserve"> </w:t>
-            </w:r>
-            <w:r>
-              <w:rPr>
-                <w:lang w:val="en-US"/>
-              </w:rPr>
-              <w:t>↘</w:t>
-            </w:r>
-            <w:r>
-              <w:rPr>
-                <w:lang w:val="en-US"/>
-              </w:rPr>
-              <w:t xml:space="preserve"> </w:t>
-            </w:r>
-            <w:r>
-              <w:rPr>
-                <w:lang w:val="en-US"/>
-              </w:rPr>
-              <w:t>{% else %}</w:t>
-            </w:r>
-            <w:r>
-              <w:rPr>
-                <w:lang w:val="en-US"/>
-              </w:rPr>
-              <w:t xml:space="preserve"> </w:t>
-            </w:r>
-            <w:r>
-              <w:rPr>
-                <w:lang w:val="en-US"/>
-              </w:rPr>
-              <w:t>→</w:t>
-            </w:r>
-            <w:r>
-              <w:rPr>
-                <w:lang w:val="en-US"/>
-              </w:rPr>
-              <w:t xml:space="preserve"> </w:t>
-            </w:r>
-            <w:r>
-              <w:rPr>
-                <w:lang w:val="en-US"/>
-              </w:rPr>
-              <w:t>{% endif %}{% endif %}{%</w:t>
-            </w:r>
-            <w:r>
-              <w:rPr>
-                <w:lang w:val="en-US"/>
-              </w:rPr>
-              <w:t xml:space="preserve"> </w:t>
-            </w:r>
-            <w:proofErr w:type="spellStart"/>
-            <w:r>
-              <w:rPr>
-                <w:lang w:val="en-US"/>
-              </w:rPr>
-              <w:t>endfor</w:t>
-            </w:r>
-            <w:proofErr w:type="spellEnd"/>
-            <w:r>
-              <w:rPr>
-                <w:lang w:val="en-US"/>
-              </w:rPr>
-              <w:t xml:space="preserve"> %}</w:t>
+              <w:t>{% for evo in row.evolution %}{% if not loop.first an</w:t>
+            </w:r>
+            <w:r>
+              <w:rPr>
+                <w:lang w:val="en-US"/>
+              </w:rPr>
+              <w:t>d evo is not none</w:t>
+            </w:r>
+            <w:r>
+              <w:rPr>
+                <w:lang w:val="en-US"/>
+              </w:rPr>
+              <w:t xml:space="preserve"> %}{% if evo </w:t>
+            </w:r>
+            <w:r>
+              <w:rPr>
+                <w:lang w:val="en-US"/>
+              </w:rPr>
+              <w:t xml:space="preserve">is </w:t>
+            </w:r>
+            <w:r>
+              <w:rPr>
+                <w:lang w:val="en-US"/>
+              </w:rPr>
+              <w:t xml:space="preserve">sameas </w:t>
+            </w:r>
+            <w:r>
+              <w:rPr>
+                <w:lang w:val="en-US"/>
+              </w:rPr>
+              <w:t xml:space="preserve"> true</w:t>
+            </w:r>
+            <w:r>
+              <w:rPr>
+                <w:lang w:val="en-US"/>
+              </w:rPr>
+              <w:t>%} ↗ {% elif evo is sameas false %} ↘ {% else %} → {% endif %}{% endif %}{% endfor %}</w:t>
             </w:r>
           </w:p>
         </w:tc>

</xml_diff>